<commit_message>
correção, adicionando nome e rm.
</commit_message>
<xml_diff>
--- a/organizacao/MVP_Carrinho_Robo.docx
+++ b/organizacao/MVP_Carrinho_Robo.docx
@@ -4343,7 +4343,7 @@
                 <w:szCs w:val="20"/>
                 <w:rtl w:val="0"/>
               </w:rPr>
-              <w:t xml:space="preserve">BL08 — Programar firmware básico de movimento</w:t>
+              <w:t xml:space="preserve">BL08 — Programar código básico de movimento</w:t>
             </w:r>
             <w:r>
               <w:rPr>
@@ -4366,7 +4366,7 @@
                 <w:szCs w:val="20"/>
                 <w:rtl w:val="0"/>
               </w:rPr>
-              <w:t xml:space="preserve">BL09 — Testar controle remoto via Wi-Fi (frente/ré/vira)</w:t>
+              <w:t xml:space="preserve">BL09 — Testar controle remoto via Bluetooth (frente/ré/vira)</w:t>
             </w:r>
             <w:r>
               <w:rPr>
@@ -4412,7 +4412,7 @@
                 <w:szCs w:val="20"/>
                 <w:rtl w:val="0"/>
               </w:rPr>
-              <w:t xml:space="preserve">BL11 — Integrar sensor ultrassônico</w:t>
+              <w:t xml:space="preserve">BL12 — interface simples de controle (app/web)</w:t>
             </w:r>
             <w:r>
               <w:rPr>
@@ -4435,122 +4435,7 @@
                 <w:szCs w:val="20"/>
                 <w:rtl w:val="0"/>
               </w:rPr>
-              <w:t xml:space="preserve">BL12 — Criar interface simples de controle (app/web)</w:t>
-            </w:r>
-            <w:r>
-              <w:rPr>
-                <w:rtl w:val="0"/>
-              </w:rPr>
-            </w:r>
-          </w:p>
-          <w:p>
-            <w:pPr>
-              <w:numPr>
-                <w:ilvl w:val="0"/>
-                <w:numId w:val="1"/>
-              </w:numPr>
-              <w:spacing w:after="60" w:lineRule="auto"/>
-              <w:ind w:left="504" w:hanging="259"/>
-            </w:pPr>
-            <w:r>
-              <w:rPr>
-                <w:sz w:val="20"/>
-                <w:szCs w:val="20"/>
-                <w:rtl w:val="0"/>
-              </w:rPr>
-              <w:t xml:space="preserve">BL13 — Adicionar LED indicador de status</w:t>
-            </w:r>
-            <w:r>
-              <w:rPr>
-                <w:rtl w:val="0"/>
-              </w:rPr>
-            </w:r>
-          </w:p>
-          <w:p>
-            <w:pPr>
-              <w:numPr>
-                <w:ilvl w:val="0"/>
-                <w:numId w:val="1"/>
-              </w:numPr>
-              <w:spacing w:after="60" w:lineRule="auto"/>
-              <w:ind w:left="504" w:hanging="259"/>
-            </w:pPr>
-            <w:r>
-              <w:rPr>
-                <w:sz w:val="20"/>
-                <w:szCs w:val="20"/>
-                <w:rtl w:val="0"/>
-              </w:rPr>
-              <w:t xml:space="preserve">BL14 — Ajustar velocidade dos motores (PWM)</w:t>
-            </w:r>
-            <w:r>
-              <w:rPr>
-                <w:rtl w:val="0"/>
-              </w:rPr>
-            </w:r>
-          </w:p>
-          <w:p>
-            <w:pPr>
-              <w:numPr>
-                <w:ilvl w:val="0"/>
-                <w:numId w:val="1"/>
-              </w:numPr>
-              <w:spacing w:after="60" w:lineRule="auto"/>
-              <w:ind w:left="504" w:hanging="259"/>
-            </w:pPr>
-            <w:r>
-              <w:rPr>
-                <w:sz w:val="20"/>
-                <w:szCs w:val="20"/>
-                <w:rtl w:val="0"/>
-              </w:rPr>
               <w:t xml:space="preserve">BL15 — Construir carenagem final</w:t>
-            </w:r>
-            <w:r>
-              <w:rPr>
-                <w:rtl w:val="0"/>
-              </w:rPr>
-            </w:r>
-          </w:p>
-          <w:p>
-            <w:pPr>
-              <w:numPr>
-                <w:ilvl w:val="0"/>
-                <w:numId w:val="1"/>
-              </w:numPr>
-              <w:spacing w:after="60" w:lineRule="auto"/>
-              <w:ind w:left="504" w:hanging="259"/>
-            </w:pPr>
-            <w:r>
-              <w:rPr>
-                <w:sz w:val="20"/>
-                <w:szCs w:val="20"/>
-                <w:rtl w:val="0"/>
-              </w:rPr>
-              <w:t xml:space="preserve">BL16 — Adicionar buzzer</w:t>
-            </w:r>
-            <w:r>
-              <w:rPr>
-                <w:rtl w:val="0"/>
-              </w:rPr>
-            </w:r>
-          </w:p>
-          <w:p>
-            <w:pPr>
-              <w:numPr>
-                <w:ilvl w:val="0"/>
-                <w:numId w:val="1"/>
-              </w:numPr>
-              <w:spacing w:after="60" w:lineRule="auto"/>
-              <w:ind w:left="504" w:hanging="259"/>
-            </w:pPr>
-            <w:r>
-              <w:rPr>
-                <w:sz w:val="20"/>
-                <w:szCs w:val="20"/>
-                <w:rtl w:val="0"/>
-              </w:rPr>
-              <w:t xml:space="preserve">BL17 — Implementar modo autônomo simples</w:t>
             </w:r>
             <w:r>
               <w:rPr>
@@ -4845,49 +4730,12 @@
       </w:r>
     </w:p>
     <w:sectPr>
-      <w:footerReference r:id="rId6" w:type="default"/>
       <w:pgSz w:h="16838" w:w="11906" w:orient="portrait"/>
       <w:pgMar w:bottom="1000" w:top="1000" w:left="1100" w:right="1100" w:header="708" w:footer="708"/>
       <w:pgNumType w:start="1"/>
     </w:sectPr>
   </w:body>
 </w:document>
-</file>
-
-<file path=word/footer1.xml><?xml version="1.0" encoding="utf-8"?>
-<w:ftr xmlns:mc="http://schemas.openxmlformats.org/markup-compatibility/2006" xmlns:o="urn:schemas-microsoft-com:office:office" xmlns:r="http://schemas.openxmlformats.org/officeDocument/2006/relationships" xmlns:m="http://schemas.openxmlformats.org/officeDocument/2006/math" xmlns:v="urn:schemas-microsoft-com:vml" xmlns:wp="http://schemas.openxmlformats.org/drawingml/2006/wordprocessingDrawing" xmlns:w10="urn:schemas-microsoft-com:office:word" xmlns:w="http://schemas.openxmlformats.org/wordprocessingml/2006/main" xmlns:wne="http://schemas.microsoft.com/office/word/2006/wordml" xmlns:sl="http://schemas.openxmlformats.org/schemaLibrary/2006/main" xmlns:a="http://schemas.openxmlformats.org/drawingml/2006/main" xmlns:pic="http://schemas.openxmlformats.org/drawingml/2006/picture" xmlns:c="http://schemas.openxmlformats.org/drawingml/2006/chart" xmlns:lc="http://schemas.openxmlformats.org/drawingml/2006/lockedCanvas" xmlns:dgm="http://schemas.openxmlformats.org/drawingml/2006/diagram" xmlns:wps="http://schemas.microsoft.com/office/word/2010/wordprocessingShape" xmlns:wpg="http://schemas.microsoft.com/office/word/2010/wordprocessingGroup" xmlns:w14="http://schemas.microsoft.com/office/word/2010/wordml" xmlns:w15="http://schemas.microsoft.com/office/word/2012/wordml" xmlns:w16="http://schemas.microsoft.com/office/word/2018/wordml" xmlns:w16cex="http://schemas.microsoft.com/office/word/2018/wordml/cex" xmlns:w16cid="http://schemas.microsoft.com/office/word/2016/wordml/cid" xmlns="http://schemas.microsoft.com/office/tasks/2019/documenttasks" xmlns:cr="http://schemas.microsoft.com/office/comments/2020/reactions">
-  <w:p>
-    <w:pPr>
-      <w:jc w:val="center"/>
-      <w:rPr/>
-    </w:pPr>
-    <w:r>
-      <w:rPr>
-        <w:color w:val="666666"/>
-        <w:sz w:val="16"/>
-        <w:szCs w:val="16"/>
-        <w:rtl w:val="0"/>
-      </w:rPr>
-      <w:t xml:space="preserve">Tarefa 17 — Carrinho-Robô  |  Página </w:t>
-    </w:r>
-    <w:r>
-      <w:rPr>
-        <w:color w:val="666666"/>
-        <w:sz w:val="16"/>
-        <w:szCs w:val="16"/>
-      </w:rPr>
-      <w:fldChar w:fldCharType="begin"/>
-      <w:instrText xml:space="preserve">PAGE</w:instrText>
-      <w:fldChar w:fldCharType="separate"/>
-      <w:fldChar w:fldCharType="end"/>
-    </w:r>
-    <w:r>
-      <w:rPr>
-        <w:rtl w:val="0"/>
-      </w:rPr>
-    </w:r>
-  </w:p>
-</w:ftr>
 </file>
 
 <file path=word/numbering.xml><?xml version="1.0" encoding="utf-8"?>

</xml_diff>